<commit_message>
Finalize Skills Hub documentation
</commit_message>
<xml_diff>
--- a/knowledge/guides/MANAGER_GUIDE.docx
+++ b/knowledge/guides/MANAGER_GUIDE.docx
@@ -2,7 +2,7 @@
 <file path=word/document.xml><?xml version="1.0" encoding="utf-8"?>
 <w:document xmlns:w="http://schemas.openxmlformats.org/wordprocessingml/2006/main" xmlns:m="http://schemas.openxmlformats.org/officeDocument/2006/math" xmlns:r="http://schemas.openxmlformats.org/officeDocument/2006/relationships" xmlns:o="urn:schemas-microsoft-com:office:office" xmlns:v="urn:schemas-microsoft-com:vml" xmlns:w10="urn:schemas-microsoft-com:office:word" xmlns:a="http://schemas.openxmlformats.org/drawingml/2006/main" xmlns:pic="http://schemas.openxmlformats.org/drawingml/2006/picture" xmlns:wp="http://schemas.openxmlformats.org/drawingml/2006/wordprocessingDrawing">
   <w:body>
-    <w:bookmarkStart w:id="26" w:name="skills-hub---manager-guide"/>
+    <w:bookmarkStart w:id="18" w:name="skills-hub---manager-guide"/>
     <w:p>
       <w:pPr>
         <w:pStyle w:val="Heading1"/>
@@ -11,45 +11,22 @@
         <w:t xml:space="preserve">Skills Hub - Manager Guide</w:t>
       </w:r>
     </w:p>
-    <w:bookmarkStart w:id="9" w:name="overview"/>
-    <w:p>
-      <w:pPr>
-        <w:pStyle w:val="Heading2"/>
-      </w:pPr>
-      <w:r>
-        <w:t xml:space="preserve">Overview</w:t>
-      </w:r>
-    </w:p>
     <w:p>
       <w:pPr>
         <w:pStyle w:val="FirstParagraph"/>
       </w:pPr>
-      <w:r>
-        <w:t xml:space="preserve">As a manager, you have a critical role in Skills Hub: validating your team’s self-assessed skills to ensure accuracy across the organization. You have access to all the features available to regular employees, plus the</w:t>
-      </w:r>
-      <w:r>
-        <w:t xml:space="preserve"> </w:t>
-      </w:r>
       <w:r>
         <w:rPr>
           <w:b/>
           <w:bCs/>
         </w:rPr>
-        <w:t xml:space="preserve">Manager View</w:t>
+        <w:t xml:space="preserve">Audience:</w:t>
       </w:r>
       <w:r>
         <w:t xml:space="preserve"> </w:t>
       </w:r>
       <w:r>
-        <w:t xml:space="preserve">tab and validation capabilities.</w:t>
-      </w:r>
-    </w:p>
-    <w:p>
-      <w:pPr>
-        <w:pStyle w:val="BodyText"/>
-      </w:pPr>
-      <w:r>
-        <w:t xml:space="preserve">Your role requires the</w:t>
+        <w:t xml:space="preserve">Managers reviewing skills for direct reports.</w:t>
       </w:r>
       <w:r>
         <w:t xml:space="preserve"> </w:t>
@@ -59,42 +36,101 @@
           <w:b/>
           <w:bCs/>
         </w:rPr>
-        <w:t xml:space="preserve">skill_manager</w:t>
+        <w:t xml:space="preserve">Last updated:</w:t>
       </w:r>
       <w:r>
         <w:t xml:space="preserve"> </w:t>
       </w:r>
       <w:r>
-        <w:t xml:space="preserve">role in ServiceNow.</w:t>
-      </w:r>
-    </w:p>
-    <w:p>
-      <w:r>
-        <w:pict>
-          <v:rect style="width:0;height:1.5pt" o:hralign="center" o:hrstd="t" o:hr="t"/>
-        </w:pict>
+        <w:t xml:space="preserve">2026-04-29</w:t>
+      </w:r>
+    </w:p>
+    <w:bookmarkStart w:id="9" w:name="overview"/>
+    <w:p>
+      <w:pPr>
+        <w:pStyle w:val="Heading2"/>
+      </w:pPr>
+      <w:r>
+        <w:t xml:space="preserve">Overview</w:t>
+      </w:r>
+    </w:p>
+    <w:p>
+      <w:pPr>
+        <w:pStyle w:val="FirstParagraph"/>
+      </w:pPr>
+      <w:r>
+        <w:t xml:space="preserve">Managers use Skills Hub to review team skills, validate accurate assessments, and identify skills that need follow-up. The manager experience appears as the</w:t>
+      </w:r>
+      <w:r>
+        <w:t xml:space="preserve"> </w:t>
+      </w:r>
+      <w:r>
+        <w:rPr>
+          <w:b/>
+          <w:bCs/>
+        </w:rPr>
+        <w:t xml:space="preserve">Team Review</w:t>
+      </w:r>
+      <w:r>
+        <w:t xml:space="preserve"> </w:t>
+      </w:r>
+      <w:r>
+        <w:t xml:space="preserve">tab for users with direct reports in ServiceNow.</w:t>
+      </w:r>
+    </w:p>
+    <w:p>
+      <w:pPr>
+        <w:pStyle w:val="BodyText"/>
+      </w:pPr>
+      <w:r>
+        <w:t xml:space="preserve">Managers can still use the employee features: My Skills, Find Experts, and Skill Library.</w:t>
       </w:r>
     </w:p>
     <w:bookmarkEnd w:id="9"/>
-    <w:bookmarkStart w:id="10" w:name="accessing-the-manager-view"/>
+    <w:bookmarkStart w:id="10" w:name="accessing-team-review"/>
     <w:p>
       <w:pPr>
         <w:pStyle w:val="Heading2"/>
       </w:pPr>
       <w:r>
-        <w:t xml:space="preserve">Accessing the Manager View</w:t>
-      </w:r>
-    </w:p>
-    <w:p>
-      <w:pPr>
-        <w:pStyle w:val="Compact"/>
+        <w:t xml:space="preserve">Accessing Team Review</w:t>
+      </w:r>
+    </w:p>
+    <w:p>
+      <w:pPr>
         <w:numPr>
           <w:ilvl w:val="0"/>
           <w:numId w:val="1001"/>
         </w:numPr>
       </w:pPr>
       <w:r>
-        <w:t xml:space="preserve">Navigate to</w:t>
+        <w:t xml:space="preserve">Open Skills Hub:</w:t>
+      </w:r>
+    </w:p>
+    <w:p>
+      <w:pPr>
+        <w:pStyle w:val="SourceCode"/>
+        <w:numPr>
+          <w:ilvl w:val="0"/>
+          <w:numId w:val="1000"/>
+        </w:numPr>
+      </w:pPr>
+      <w:r>
+        <w:rPr>
+          <w:rStyle w:val="VerbatimChar"/>
+        </w:rPr>
+        <w:t xml:space="preserve">/sp?id=skills_hub</w:t>
+      </w:r>
+    </w:p>
+    <w:p>
+      <w:pPr>
+        <w:numPr>
+          <w:ilvl w:val="0"/>
+          <w:numId w:val="1001"/>
+        </w:numPr>
+      </w:pPr>
+      <w:r>
+        <w:t xml:space="preserve">Select</w:t>
       </w:r>
       <w:r>
         <w:t xml:space="preserve"> </w:t>
@@ -104,13 +140,18 @@
           <w:b/>
           <w:bCs/>
         </w:rPr>
-        <w:t xml:space="preserve">Skills Hub</w:t>
-      </w:r>
-      <w:r>
-        <w:t xml:space="preserve"> </w:t>
-      </w:r>
-      <w:r>
-        <w:t xml:space="preserve">in the left navigation, or go to</w:t>
+        <w:t xml:space="preserve">Team Review</w:t>
+      </w:r>
+      <w:r>
+        <w:t xml:space="preserve">.</w:t>
+      </w:r>
+    </w:p>
+    <w:p>
+      <w:pPr>
+        <w:pStyle w:val="FirstParagraph"/>
+      </w:pPr>
+      <w:r>
+        <w:t xml:space="preserve">If the tab does not appear, confirm that the employee records have your user set in the</w:t>
       </w:r>
       <w:r>
         <w:t xml:space="preserve"> </w:t>
@@ -119,7 +160,39 @@
         <w:rPr>
           <w:rStyle w:val="VerbatimChar"/>
         </w:rPr>
-        <w:t xml:space="preserve">?id=skills_hub</w:t>
+        <w:t xml:space="preserve">manager</w:t>
+      </w:r>
+      <w:r>
+        <w:t xml:space="preserve"> </w:t>
+      </w:r>
+      <w:r>
+        <w:t xml:space="preserve">field.</w:t>
+      </w:r>
+    </w:p>
+    <w:bookmarkEnd w:id="10"/>
+    <w:bookmarkStart w:id="11" w:name="team-review-layout"/>
+    <w:p>
+      <w:pPr>
+        <w:pStyle w:val="Heading2"/>
+      </w:pPr>
+      <w:r>
+        <w:t xml:space="preserve">Team Review Layout</w:t>
+      </w:r>
+    </w:p>
+    <w:p>
+      <w:pPr>
+        <w:pStyle w:val="FirstParagraph"/>
+      </w:pPr>
+      <w:r>
+        <w:t xml:space="preserve">Team Review shows direct reports and their skills in a compact review matrix. The view is optimized for scanning status and taking action.</w:t>
+      </w:r>
+    </w:p>
+    <w:p>
+      <w:pPr>
+        <w:pStyle w:val="BodyText"/>
+      </w:pPr>
+      <w:r>
+        <w:t xml:space="preserve">Each skill row or chip can include:</w:t>
       </w:r>
     </w:p>
     <w:p>
@@ -127,27 +200,105 @@
         <w:pStyle w:val="Compact"/>
         <w:numPr>
           <w:ilvl w:val="0"/>
-          <w:numId w:val="1001"/>
+          <w:numId w:val="1002"/>
         </w:numPr>
       </w:pPr>
       <w:r>
-        <w:t xml:space="preserve">Click the</w:t>
-      </w:r>
-      <w:r>
-        <w:t xml:space="preserve"> </w:t>
-      </w:r>
-      <w:r>
-        <w:rPr>
-          <w:b/>
-          <w:bCs/>
-        </w:rPr>
-        <w:t xml:space="preserve">Manager View</w:t>
-      </w:r>
-      <w:r>
-        <w:t xml:space="preserve"> </w:t>
-      </w:r>
-      <w:r>
-        <w:t xml:space="preserve">tab (visible only to users with direct reports)</w:t>
+        <w:t xml:space="preserve">Employee name</w:t>
+      </w:r>
+    </w:p>
+    <w:p>
+      <w:pPr>
+        <w:pStyle w:val="Compact"/>
+        <w:numPr>
+          <w:ilvl w:val="0"/>
+          <w:numId w:val="1002"/>
+        </w:numPr>
+      </w:pPr>
+      <w:r>
+        <w:t xml:space="preserve">Skill name</w:t>
+      </w:r>
+    </w:p>
+    <w:p>
+      <w:pPr>
+        <w:pStyle w:val="Compact"/>
+        <w:numPr>
+          <w:ilvl w:val="0"/>
+          <w:numId w:val="1002"/>
+        </w:numPr>
+      </w:pPr>
+      <w:r>
+        <w:t xml:space="preserve">Employee-assessed level</w:t>
+      </w:r>
+    </w:p>
+    <w:p>
+      <w:pPr>
+        <w:pStyle w:val="Compact"/>
+        <w:numPr>
+          <w:ilvl w:val="0"/>
+          <w:numId w:val="1002"/>
+        </w:numPr>
+      </w:pPr>
+      <w:r>
+        <w:t xml:space="preserve">Manager-suggested level, when available</w:t>
+      </w:r>
+    </w:p>
+    <w:p>
+      <w:pPr>
+        <w:pStyle w:val="Compact"/>
+        <w:numPr>
+          <w:ilvl w:val="0"/>
+          <w:numId w:val="1002"/>
+        </w:numPr>
+      </w:pPr>
+      <w:r>
+        <w:t xml:space="preserve">Validation status</w:t>
+      </w:r>
+    </w:p>
+    <w:p>
+      <w:pPr>
+        <w:pStyle w:val="Compact"/>
+        <w:numPr>
+          <w:ilvl w:val="0"/>
+          <w:numId w:val="1002"/>
+        </w:numPr>
+      </w:pPr>
+      <w:r>
+        <w:t xml:space="preserve">Endorsement count</w:t>
+      </w:r>
+    </w:p>
+    <w:p>
+      <w:pPr>
+        <w:pStyle w:val="Compact"/>
+        <w:numPr>
+          <w:ilvl w:val="0"/>
+          <w:numId w:val="1002"/>
+        </w:numPr>
+      </w:pPr>
+      <w:r>
+        <w:t xml:space="preserve">Last review date</w:t>
+      </w:r>
+    </w:p>
+    <w:p>
+      <w:pPr>
+        <w:pStyle w:val="Compact"/>
+        <w:numPr>
+          <w:ilvl w:val="0"/>
+          <w:numId w:val="1002"/>
+        </w:numPr>
+      </w:pPr>
+      <w:r>
+        <w:t xml:space="preserve">Dispute or review notes</w:t>
+      </w:r>
+    </w:p>
+    <w:bookmarkEnd w:id="11"/>
+    <w:bookmarkStart w:id="12" w:name="filters"/>
+    <w:p>
+      <w:pPr>
+        <w:pStyle w:val="Heading2"/>
+      </w:pPr>
+      <w:r>
+        <w:t xml:space="preserve">Filters</w:t>
       </w:r>
     </w:p>
     <w:p>
@@ -155,32 +306,7 @@
         <w:pStyle w:val="FirstParagraph"/>
       </w:pPr>
       <w:r>
-        <w:t xml:space="preserve">The Manager Matrix displays all of your direct reports with their skills, proficiency levels, and validation status.</w:t>
-      </w:r>
-    </w:p>
-    <w:p>
-      <w:r>
-        <w:pict>
-          <v:rect style="width:0;height:1.5pt" o:hralign="center" o:hrstd="t" o:hr="t"/>
-        </w:pict>
-      </w:r>
-    </w:p>
-    <w:bookmarkEnd w:id="10"/>
-    <w:bookmarkStart w:id="12" w:name="understanding-the-manager-matrix"/>
-    <w:p>
-      <w:pPr>
-        <w:pStyle w:val="Heading2"/>
-      </w:pPr>
-      <w:r>
-        <w:t xml:space="preserve">Understanding the Manager Matrix</w:t>
-      </w:r>
-    </w:p>
-    <w:p>
-      <w:pPr>
-        <w:pStyle w:val="FirstParagraph"/>
-      </w:pPr>
-      <w:r>
-        <w:t xml:space="preserve">The matrix shows each direct report as a row with their skills displayed as cards. Each skill card shows:</w:t>
+        <w:t xml:space="preserve">Use the Team Review filters to focus the list.</w:t>
       </w:r>
     </w:p>
     <w:tbl>
@@ -191,8 +317,336 @@
         <w:tblLook w:firstRow="1" w:lastRow="0" w:firstColumn="0" w:lastColumn="0" w:noHBand="0" w:noVBand="0" w:val="0020"/>
       </w:tblPr>
       <w:tblGrid>
-        <w:gridCol w:w="2772"/>
-        <w:gridCol w:w="5148"/>
+        <w:gridCol w:w="3960"/>
+        <w:gridCol w:w="3960"/>
+      </w:tblGrid>
+      <w:tr>
+        <w:trPr>
+          <w:tblHeader w:val="on"/>
+        </w:trPr>
+        <w:tc>
+          <w:tcPr/>
+          <w:p>
+            <w:pPr>
+              <w:pStyle w:val="Compact"/>
+            </w:pPr>
+            <w:r>
+              <w:t xml:space="preserve">Filter</w:t>
+            </w:r>
+          </w:p>
+        </w:tc>
+        <w:tc>
+          <w:tcPr/>
+          <w:p>
+            <w:pPr>
+              <w:pStyle w:val="Compact"/>
+            </w:pPr>
+            <w:r>
+              <w:t xml:space="preserve">Purpose</w:t>
+            </w:r>
+          </w:p>
+        </w:tc>
+      </w:tr>
+      <w:tr>
+        <w:tc>
+          <w:tcPr/>
+          <w:p>
+            <w:pPr>
+              <w:pStyle w:val="Compact"/>
+            </w:pPr>
+            <w:r>
+              <w:t xml:space="preserve">Reports</w:t>
+            </w:r>
+          </w:p>
+        </w:tc>
+        <w:tc>
+          <w:tcPr/>
+          <w:p>
+            <w:pPr>
+              <w:pStyle w:val="Compact"/>
+            </w:pPr>
+            <w:r>
+              <w:t xml:space="preserve">Show all direct report skill rows.</w:t>
+            </w:r>
+          </w:p>
+        </w:tc>
+      </w:tr>
+      <w:tr>
+        <w:tc>
+          <w:tcPr/>
+          <w:p>
+            <w:pPr>
+              <w:pStyle w:val="Compact"/>
+            </w:pPr>
+            <w:r>
+              <w:t xml:space="preserve">Pending</w:t>
+            </w:r>
+          </w:p>
+        </w:tc>
+        <w:tc>
+          <w:tcPr/>
+          <w:p>
+            <w:pPr>
+              <w:pStyle w:val="Compact"/>
+            </w:pPr>
+            <w:r>
+              <w:t xml:space="preserve">Show skills waiting for manager review.</w:t>
+            </w:r>
+          </w:p>
+        </w:tc>
+      </w:tr>
+      <w:tr>
+        <w:tc>
+          <w:tcPr/>
+          <w:p>
+            <w:pPr>
+              <w:pStyle w:val="Compact"/>
+            </w:pPr>
+            <w:r>
+              <w:t xml:space="preserve">Verified or Validated</w:t>
+            </w:r>
+          </w:p>
+        </w:tc>
+        <w:tc>
+          <w:tcPr/>
+          <w:p>
+            <w:pPr>
+              <w:pStyle w:val="Compact"/>
+            </w:pPr>
+            <w:r>
+              <w:t xml:space="preserve">Show skills already confirmed.</w:t>
+            </w:r>
+          </w:p>
+        </w:tc>
+      </w:tr>
+      <w:tr>
+        <w:tc>
+          <w:tcPr/>
+          <w:p>
+            <w:pPr>
+              <w:pStyle w:val="Compact"/>
+            </w:pPr>
+            <w:r>
+              <w:t xml:space="preserve">Disputed</w:t>
+            </w:r>
+          </w:p>
+        </w:tc>
+        <w:tc>
+          <w:tcPr/>
+          <w:p>
+            <w:pPr>
+              <w:pStyle w:val="Compact"/>
+            </w:pPr>
+            <w:r>
+              <w:t xml:space="preserve">Show skills where a manager suggested a different level or left notes.</w:t>
+            </w:r>
+          </w:p>
+        </w:tc>
+      </w:tr>
+      <w:tr>
+        <w:tc>
+          <w:tcPr/>
+          <w:p>
+            <w:pPr>
+              <w:pStyle w:val="Compact"/>
+            </w:pPr>
+            <w:r>
+              <w:t xml:space="preserve">Review</w:t>
+            </w:r>
+          </w:p>
+        </w:tc>
+        <w:tc>
+          <w:tcPr/>
+          <w:p>
+            <w:pPr>
+              <w:pStyle w:val="Compact"/>
+            </w:pPr>
+            <w:r>
+              <w:t xml:space="preserve">Show skills needing review attention, depending on the configured status count.</w:t>
+            </w:r>
+          </w:p>
+        </w:tc>
+      </w:tr>
+    </w:tbl>
+    <w:p>
+      <w:pPr>
+        <w:pStyle w:val="BodyText"/>
+      </w:pPr>
+      <w:r>
+        <w:t xml:space="preserve">The filters should update the matrix without showing blank filler rows.</w:t>
+      </w:r>
+    </w:p>
+    <w:bookmarkEnd w:id="12"/>
+    <w:bookmarkStart w:id="13" w:name="validating-skills"/>
+    <w:p>
+      <w:pPr>
+        <w:pStyle w:val="Heading2"/>
+      </w:pPr>
+      <w:r>
+        <w:t xml:space="preserve">Validating Skills</w:t>
+      </w:r>
+    </w:p>
+    <w:p>
+      <w:pPr>
+        <w:pStyle w:val="FirstParagraph"/>
+      </w:pPr>
+      <w:r>
+        <w:t xml:space="preserve">Validate a skill when you agree with the employee’s assessment.</w:t>
+      </w:r>
+    </w:p>
+    <w:p>
+      <w:pPr>
+        <w:pStyle w:val="Compact"/>
+        <w:numPr>
+          <w:ilvl w:val="0"/>
+          <w:numId w:val="1003"/>
+        </w:numPr>
+      </w:pPr>
+      <w:r>
+        <w:t xml:space="preserve">Find the employee and skill in Team Review.</w:t>
+      </w:r>
+    </w:p>
+    <w:p>
+      <w:pPr>
+        <w:pStyle w:val="Compact"/>
+        <w:numPr>
+          <w:ilvl w:val="0"/>
+          <w:numId w:val="1003"/>
+        </w:numPr>
+      </w:pPr>
+      <w:r>
+        <w:t xml:space="preserve">Open the skill review action.</w:t>
+      </w:r>
+    </w:p>
+    <w:p>
+      <w:pPr>
+        <w:pStyle w:val="Compact"/>
+        <w:numPr>
+          <w:ilvl w:val="0"/>
+          <w:numId w:val="1003"/>
+        </w:numPr>
+      </w:pPr>
+      <w:r>
+        <w:t xml:space="preserve">Confirm the level.</w:t>
+      </w:r>
+    </w:p>
+    <w:p>
+      <w:pPr>
+        <w:pStyle w:val="Compact"/>
+        <w:numPr>
+          <w:ilvl w:val="0"/>
+          <w:numId w:val="1003"/>
+        </w:numPr>
+      </w:pPr>
+      <w:r>
+        <w:t xml:space="preserve">Select</w:t>
+      </w:r>
+      <w:r>
+        <w:t xml:space="preserve"> </w:t>
+      </w:r>
+      <w:r>
+        <w:rPr>
+          <w:b/>
+          <w:bCs/>
+        </w:rPr>
+        <w:t xml:space="preserve">Validate</w:t>
+      </w:r>
+      <w:r>
+        <w:t xml:space="preserve">.</w:t>
+      </w:r>
+    </w:p>
+    <w:p>
+      <w:pPr>
+        <w:pStyle w:val="FirstParagraph"/>
+      </w:pPr>
+      <w:r>
+        <w:t xml:space="preserve">Validation updates the skill record and stamps the latest manager validation timestamp.</w:t>
+      </w:r>
+    </w:p>
+    <w:bookmarkEnd w:id="13"/>
+    <w:bookmarkStart w:id="14" w:name="disputing-a-skill"/>
+    <w:p>
+      <w:pPr>
+        <w:pStyle w:val="Heading2"/>
+      </w:pPr>
+      <w:r>
+        <w:t xml:space="preserve">Disputing a Skill</w:t>
+      </w:r>
+    </w:p>
+    <w:p>
+      <w:pPr>
+        <w:pStyle w:val="FirstParagraph"/>
+      </w:pPr>
+      <w:r>
+        <w:t xml:space="preserve">Dispute a skill when the employee assessment needs follow-up.</w:t>
+      </w:r>
+    </w:p>
+    <w:p>
+      <w:pPr>
+        <w:pStyle w:val="Compact"/>
+        <w:numPr>
+          <w:ilvl w:val="0"/>
+          <w:numId w:val="1004"/>
+        </w:numPr>
+      </w:pPr>
+      <w:r>
+        <w:t xml:space="preserve">Open the skill review action.</w:t>
+      </w:r>
+    </w:p>
+    <w:p>
+      <w:pPr>
+        <w:pStyle w:val="Compact"/>
+        <w:numPr>
+          <w:ilvl w:val="0"/>
+          <w:numId w:val="1004"/>
+        </w:numPr>
+      </w:pPr>
+      <w:r>
+        <w:t xml:space="preserve">Select the manager-suggested level.</w:t>
+      </w:r>
+    </w:p>
+    <w:p>
+      <w:pPr>
+        <w:pStyle w:val="Compact"/>
+        <w:numPr>
+          <w:ilvl w:val="0"/>
+          <w:numId w:val="1004"/>
+        </w:numPr>
+      </w:pPr>
+      <w:r>
+        <w:t xml:space="preserve">Add review notes.</w:t>
+      </w:r>
+    </w:p>
+    <w:p>
+      <w:pPr>
+        <w:pStyle w:val="Compact"/>
+        <w:numPr>
+          <w:ilvl w:val="0"/>
+          <w:numId w:val="1004"/>
+        </w:numPr>
+      </w:pPr>
+      <w:r>
+        <w:t xml:space="preserve">Submit the dispute.</w:t>
+      </w:r>
+    </w:p>
+    <w:p>
+      <w:pPr>
+        <w:pStyle w:val="FirstParagraph"/>
+      </w:pPr>
+      <w:r>
+        <w:t xml:space="preserve">The dispute state is stored on the employee skill record:</w:t>
+      </w:r>
+    </w:p>
+    <w:tbl>
+      <w:tblPr>
+        <w:tblStyle w:val="Table"/>
+        <w:tblW w:type="pct" w:w="5000"/>
+        <w:tblLayout w:type="fixed"/>
+        <w:tblLook w:firstRow="1" w:lastRow="0" w:firstColumn="0" w:lastColumn="0" w:noHBand="0" w:noVBand="0" w:val="0020"/>
+      </w:tblPr>
+      <w:tblGrid>
+        <w:gridCol w:w="3960"/>
+        <w:gridCol w:w="3960"/>
       </w:tblGrid>
       <w:tr>
         <w:trPr>
@@ -216,7 +670,7 @@
               <w:pStyle w:val="Compact"/>
             </w:pPr>
             <w:r>
-              <w:t xml:space="preserve">Description</w:t>
+              <w:t xml:space="preserve">Purpose</w:t>
             </w:r>
           </w:p>
         </w:tc>
@@ -230,10 +684,9 @@
             </w:pPr>
             <w:r>
               <w:rPr>
-                <w:b/>
-                <w:bCs/>
+                <w:rStyle w:val="VerbatimChar"/>
               </w:rPr>
-              <w:t xml:space="preserve">Skill Name</w:t>
+              <w:t xml:space="preserve">u_validation_status</w:t>
             </w:r>
           </w:p>
         </w:tc>
@@ -244,7 +697,7 @@
               <w:pStyle w:val="Compact"/>
             </w:pPr>
             <w:r>
-              <w:t xml:space="preserve">The skill being assessed</w:t>
+              <w:t xml:space="preserve">Stores the dispute or validation state.</w:t>
             </w:r>
           </w:p>
         </w:tc>
@@ -258,10 +711,9 @@
             </w:pPr>
             <w:r>
               <w:rPr>
-                <w:b/>
-                <w:bCs/>
+                <w:rStyle w:val="VerbatimChar"/>
               </w:rPr>
-              <w:t xml:space="preserve">Self-Assessment</w:t>
+              <w:t xml:space="preserve">u_validation_notes</w:t>
             </w:r>
           </w:p>
         </w:tc>
@@ -272,7 +724,7 @@
               <w:pStyle w:val="Compact"/>
             </w:pPr>
             <w:r>
-              <w:t xml:space="preserve">The employee’s own proficiency rating</w:t>
+              <w:t xml:space="preserve">Stores manager notes and review context.</w:t>
             </w:r>
           </w:p>
         </w:tc>
@@ -286,10 +738,9 @@
             </w:pPr>
             <w:r>
               <w:rPr>
-                <w:b/>
-                <w:bCs/>
+                <w:rStyle w:val="VerbatimChar"/>
               </w:rPr>
-              <w:t xml:space="preserve">Manager Assessment</w:t>
+              <w:t xml:space="preserve">u_manager_assessed_level</w:t>
             </w:r>
           </w:p>
         </w:tc>
@@ -300,7 +751,7 @@
               <w:pStyle w:val="Compact"/>
             </w:pPr>
             <w:r>
-              <w:t xml:space="preserve">Your independent proficiency rating (if set)</w:t>
+              <w:t xml:space="preserve">Stores the manager-suggested level.</w:t>
             </w:r>
           </w:p>
         </w:tc>
@@ -314,10 +765,9 @@
             </w:pPr>
             <w:r>
               <w:rPr>
-                <w:b/>
-                <w:bCs/>
+                <w:rStyle w:val="VerbatimChar"/>
               </w:rPr>
-              <w:t xml:space="preserve">Endorsement Count</w:t>
+              <w:t xml:space="preserve">u_last_manager_validation</w:t>
             </w:r>
           </w:p>
         </w:tc>
@@ -328,35 +778,7 @@
               <w:pStyle w:val="Compact"/>
             </w:pPr>
             <w:r>
-              <w:t xml:space="preserve">Number of peer endorsements</w:t>
-            </w:r>
-          </w:p>
-        </w:tc>
-      </w:tr>
-      <w:tr>
-        <w:tc>
-          <w:tcPr/>
-          <w:p>
-            <w:pPr>
-              <w:pStyle w:val="Compact"/>
-            </w:pPr>
-            <w:r>
-              <w:rPr>
-                <w:b/>
-                <w:bCs/>
-              </w:rPr>
-              <w:t xml:space="preserve">Validation Status</w:t>
-            </w:r>
-          </w:p>
-        </w:tc>
-        <w:tc>
-          <w:tcPr/>
-          <w:p>
-            <w:pPr>
-              <w:pStyle w:val="Compact"/>
-            </w:pPr>
-            <w:r>
-              <w:t xml:space="preserve">Pending, Validated, Disputed, or Expired</w:t>
+              <w:t xml:space="preserve">Stores the validation or review timestamp.</w:t>
             </w:r>
           </w:p>
         </w:tc>
@@ -367,72 +789,17 @@
         <w:pStyle w:val="BodyText"/>
       </w:pPr>
       <w:r>
-        <w:t xml:space="preserve">Color coding highlights gaps between self-assessment and manager assessment.</w:t>
-      </w:r>
-    </w:p>
-    <w:bookmarkStart w:id="11" w:name="filtering-and-sorting"/>
-    <w:p>
-      <w:pPr>
-        <w:pStyle w:val="Heading3"/>
-      </w:pPr>
-      <w:r>
-        <w:t xml:space="preserve">Filtering and Sorting</w:t>
-      </w:r>
-    </w:p>
-    <w:p>
-      <w:pPr>
-        <w:pStyle w:val="Compact"/>
-        <w:numPr>
-          <w:ilvl w:val="0"/>
-          <w:numId w:val="1002"/>
-        </w:numPr>
-      </w:pPr>
-      <w:r>
-        <w:rPr>
-          <w:b/>
-          <w:bCs/>
-        </w:rPr>
-        <w:t xml:space="preserve">Filter by validation status</w:t>
-      </w:r>
-      <w:r>
-        <w:t xml:space="preserve">: Show only Pending, Validated, Disputed, or Expired skills</w:t>
-      </w:r>
-    </w:p>
-    <w:p>
-      <w:pPr>
-        <w:pStyle w:val="Compact"/>
-        <w:numPr>
-          <w:ilvl w:val="0"/>
-          <w:numId w:val="1002"/>
-        </w:numPr>
-      </w:pPr>
-      <w:r>
-        <w:rPr>
-          <w:b/>
-          <w:bCs/>
-        </w:rPr>
-        <w:t xml:space="preserve">Sort by proficiency gap</w:t>
-      </w:r>
-      <w:r>
-        <w:t xml:space="preserve">: Identify the largest discrepancies between self and manager assessments</w:t>
-      </w:r>
-    </w:p>
-    <w:p>
-      <w:r>
-        <w:pict>
-          <v:rect style="width:0;height:1.5pt" o:hralign="center" o:hrstd="t" o:hr="t"/>
-        </w:pict>
-      </w:r>
-    </w:p>
-    <w:bookmarkEnd w:id="11"/>
-    <w:bookmarkEnd w:id="12"/>
-    <w:bookmarkStart w:id="15" w:name="validating-skills"/>
+        <w:t xml:space="preserve">Disputes are not intended to be punitive. They are a way to close the loop when a skill level needs conversation or correction.</w:t>
+      </w:r>
+    </w:p>
+    <w:bookmarkEnd w:id="14"/>
+    <w:bookmarkStart w:id="15" w:name="reviewing-dispute-details"/>
     <w:p>
       <w:pPr>
         <w:pStyle w:val="Heading2"/>
       </w:pPr>
       <w:r>
-        <w:t xml:space="preserve">Validating Skills</w:t>
+        <w:t xml:space="preserve">Reviewing Dispute Details</w:t>
       </w:r>
     </w:p>
     <w:p>
@@ -440,220 +807,17 @@
         <w:pStyle w:val="FirstParagraph"/>
       </w:pPr>
       <w:r>
-        <w:t xml:space="preserve">Validation confirms that you agree with an employee’s self-assessed proficiency level.</w:t>
-      </w:r>
-    </w:p>
-    <w:bookmarkStart w:id="13" w:name="validate-a-single-skill"/>
-    <w:p>
-      <w:pPr>
-        <w:pStyle w:val="Heading3"/>
-      </w:pPr>
-      <w:r>
-        <w:t xml:space="preserve">Validate a Single Skill</w:t>
-      </w:r>
-    </w:p>
-    <w:p>
-      <w:pPr>
-        <w:pStyle w:val="Compact"/>
-        <w:numPr>
-          <w:ilvl w:val="0"/>
-          <w:numId w:val="1003"/>
-        </w:numPr>
-      </w:pPr>
-      <w:r>
-        <w:t xml:space="preserve">Click on a skill in the Manager Matrix to open the validation modal</w:t>
-      </w:r>
-    </w:p>
-    <w:p>
-      <w:pPr>
-        <w:pStyle w:val="Compact"/>
-        <w:numPr>
-          <w:ilvl w:val="0"/>
-          <w:numId w:val="1003"/>
-        </w:numPr>
-      </w:pPr>
-      <w:r>
-        <w:t xml:space="preserve">Review the employee’s self-assessed level</w:t>
-      </w:r>
-    </w:p>
-    <w:p>
-      <w:pPr>
-        <w:pStyle w:val="Compact"/>
-        <w:numPr>
-          <w:ilvl w:val="0"/>
-          <w:numId w:val="1003"/>
-        </w:numPr>
-      </w:pPr>
-      <w:r>
-        <w:t xml:space="preserve">Optionally set your own assessed level from the dropdown</w:t>
-      </w:r>
-    </w:p>
-    <w:p>
-      <w:pPr>
-        <w:pStyle w:val="Compact"/>
-        <w:numPr>
-          <w:ilvl w:val="0"/>
-          <w:numId w:val="1003"/>
-        </w:numPr>
-      </w:pPr>
-      <w:r>
-        <w:t xml:space="preserve">Click</w:t>
-      </w:r>
-      <w:r>
-        <w:t xml:space="preserve"> </w:t>
-      </w:r>
-      <w:r>
-        <w:rPr>
-          <w:b/>
-          <w:bCs/>
-        </w:rPr>
-        <w:t xml:space="preserve">Validate</w:t>
-      </w:r>
-    </w:p>
-    <w:p>
-      <w:pPr>
-        <w:pStyle w:val="FirstParagraph"/>
-      </w:pPr>
-      <w:r>
-        <w:t xml:space="preserve">This action:</w:t>
-      </w:r>
-      <w:r>
-        <w:t xml:space="preserve"> </w:t>
-      </w:r>
-      <w:r>
-        <w:t xml:space="preserve">- Sets the validation status to</w:t>
-      </w:r>
-      <w:r>
-        <w:t xml:space="preserve"> </w:t>
-      </w:r>
-      <w:r>
-        <w:rPr>
-          <w:b/>
-          <w:bCs/>
-        </w:rPr>
-        <w:t xml:space="preserve">Validated</w:t>
-      </w:r>
-      <w:r>
-        <w:t xml:space="preserve"> </w:t>
-      </w:r>
-      <w:r>
-        <w:t xml:space="preserve">- Records the current date/time as the validation date</w:t>
-      </w:r>
-      <w:r>
-        <w:t xml:space="preserve"> </w:t>
-      </w:r>
-      <w:r>
-        <w:t xml:space="preserve">- Awards the employee +15 gamification points</w:t>
-      </w:r>
-      <w:r>
-        <w:t xml:space="preserve"> </w:t>
-      </w:r>
-      <w:r>
-        <w:t xml:space="preserve">- Sends the employee an email notification</w:t>
-      </w:r>
-    </w:p>
-    <w:bookmarkEnd w:id="13"/>
-    <w:bookmarkStart w:id="14" w:name="bulk-validate"/>
-    <w:p>
-      <w:pPr>
-        <w:pStyle w:val="Heading3"/>
-      </w:pPr>
-      <w:r>
-        <w:t xml:space="preserve">Bulk Validate</w:t>
-      </w:r>
-    </w:p>
-    <w:p>
-      <w:pPr>
-        <w:pStyle w:val="FirstParagraph"/>
-      </w:pPr>
-      <w:r>
-        <w:t xml:space="preserve">To validate all pending skills for an employee at once:</w:t>
-      </w:r>
-    </w:p>
-    <w:p>
-      <w:pPr>
-        <w:pStyle w:val="Compact"/>
-        <w:numPr>
-          <w:ilvl w:val="0"/>
-          <w:numId w:val="1004"/>
-        </w:numPr>
-      </w:pPr>
-      <w:r>
-        <w:t xml:space="preserve">Find the employee’s row in the Manager Matrix</w:t>
-      </w:r>
-    </w:p>
-    <w:p>
-      <w:pPr>
-        <w:pStyle w:val="Compact"/>
-        <w:numPr>
-          <w:ilvl w:val="0"/>
-          <w:numId w:val="1004"/>
-        </w:numPr>
-      </w:pPr>
-      <w:r>
-        <w:t xml:space="preserve">Click the</w:t>
-      </w:r>
-      <w:r>
-        <w:t xml:space="preserve"> </w:t>
-      </w:r>
-      <w:r>
-        <w:rPr>
-          <w:b/>
-          <w:bCs/>
-        </w:rPr>
-        <w:t xml:space="preserve">Bulk Validate</w:t>
-      </w:r>
-      <w:r>
-        <w:t xml:space="preserve"> </w:t>
-      </w:r>
-      <w:r>
-        <w:t xml:space="preserve">button</w:t>
-      </w:r>
-    </w:p>
-    <w:p>
-      <w:pPr>
-        <w:pStyle w:val="Compact"/>
-        <w:numPr>
-          <w:ilvl w:val="0"/>
-          <w:numId w:val="1004"/>
-        </w:numPr>
-      </w:pPr>
-      <w:r>
-        <w:t xml:space="preserve">All non-validated skills are marked as Validated in a single operation</w:t>
-      </w:r>
-    </w:p>
-    <w:p>
-      <w:pPr>
-        <w:pStyle w:val="FirstParagraph"/>
-      </w:pPr>
-      <w:r>
-        <w:t xml:space="preserve">Use this when you’re confident in all of an employee’s self-assessments.</w:t>
-      </w:r>
-    </w:p>
-    <w:p>
-      <w:r>
-        <w:pict>
-          <v:rect style="width:0;height:1.5pt" o:hralign="center" o:hrstd="t" o:hr="t"/>
-        </w:pict>
-      </w:r>
-    </w:p>
-    <w:bookmarkEnd w:id="14"/>
+        <w:t xml:space="preserve">Disputed skills show a compact status indicator. Select the status indicator to view the dispute details modal. The modal shows the employee, skill, status, suggested level, and notes.</w:t>
+      </w:r>
+    </w:p>
     <w:bookmarkEnd w:id="15"/>
-    <w:bookmarkStart w:id="16" w:name="disputing-skills"/>
+    <w:bookmarkStart w:id="16" w:name="best-practices"/>
     <w:p>
       <w:pPr>
         <w:pStyle w:val="Heading2"/>
       </w:pPr>
       <w:r>
-        <w:t xml:space="preserve">Disputing Skills</w:t>
-      </w:r>
-    </w:p>
-    <w:p>
-      <w:pPr>
-        <w:pStyle w:val="FirstParagraph"/>
-      </w:pPr>
-      <w:r>
-        <w:t xml:space="preserve">If you disagree with an employee’s self-assessed proficiency level:</w:t>
+        <w:t xml:space="preserve">Best Practices</w:t>
       </w:r>
     </w:p>
     <w:p>
@@ -665,7 +829,7 @@
         </w:numPr>
       </w:pPr>
       <w:r>
-        <w:t xml:space="preserve">Click on the skill in the Manager Matrix</w:t>
+        <w:t xml:space="preserve">Review pending skills during regular one-on-ones.</w:t>
       </w:r>
     </w:p>
     <w:p>
@@ -677,7 +841,7 @@
         </w:numPr>
       </w:pPr>
       <w:r>
-        <w:t xml:space="preserve">Enter your own assessed level in the dropdown</w:t>
+        <w:t xml:space="preserve">Use dispute notes to explain the specific gap or evidence needed.</w:t>
       </w:r>
     </w:p>
     <w:p>
@@ -689,7 +853,7 @@
         </w:numPr>
       </w:pPr>
       <w:r>
-        <w:t xml:space="preserve">Enter notes explaining your assessment (required)</w:t>
+        <w:t xml:space="preserve">Re-validate after discussion when the level is aligned.</w:t>
       </w:r>
     </w:p>
     <w:p>
@@ -701,660 +865,117 @@
         </w:numPr>
       </w:pPr>
       <w:r>
-        <w:t xml:space="preserve">Click</w:t>
-      </w:r>
-      <w:r>
-        <w:t xml:space="preserve"> </w:t>
-      </w:r>
+        <w:t xml:space="preserve">Use Find Experts to compare skills across the broader organization.</w:t>
+      </w:r>
+    </w:p>
+    <w:p>
+      <w:pPr>
+        <w:pStyle w:val="Compact"/>
+        <w:numPr>
+          <w:ilvl w:val="0"/>
+          <w:numId w:val="1005"/>
+        </w:numPr>
+      </w:pPr>
+      <w:r>
+        <w:t xml:space="preserve">Use Skill Library to understand how skills are categorized before asking employees to add missing skills.</w:t>
+      </w:r>
+    </w:p>
+    <w:bookmarkEnd w:id="16"/>
+    <w:bookmarkStart w:id="17" w:name="faq"/>
+    <w:p>
+      <w:pPr>
+        <w:pStyle w:val="Heading2"/>
+      </w:pPr>
+      <w:r>
+        <w:t xml:space="preserve">FAQ</w:t>
+      </w:r>
+    </w:p>
+    <w:p>
+      <w:pPr>
+        <w:pStyle w:val="FirstParagraph"/>
+      </w:pPr>
       <w:r>
         <w:rPr>
           <w:b/>
           <w:bCs/>
         </w:rPr>
-        <w:t xml:space="preserve">Dispute</w:t>
-      </w:r>
-    </w:p>
-    <w:p>
-      <w:pPr>
-        <w:pStyle w:val="FirstParagraph"/>
-      </w:pPr>
-      <w:r>
-        <w:t xml:space="preserve">This action:</w:t>
+        <w:t xml:space="preserve">Can I review users outside my direct reporting line?</w:t>
       </w:r>
       <w:r>
         <w:t xml:space="preserve"> </w:t>
       </w:r>
       <w:r>
-        <w:t xml:space="preserve">- Sets the validation status to</w:t>
-      </w:r>
-      <w:r>
-        <w:t xml:space="preserve"> </w:t>
-      </w:r>
+        <w:t xml:space="preserve">No. Manager actions are restricted to direct reports, unless you have an administrator role.</w:t>
+      </w:r>
+    </w:p>
+    <w:p>
+      <w:pPr>
+        <w:pStyle w:val="BodyText"/>
+      </w:pPr>
       <w:r>
         <w:rPr>
           <w:b/>
           <w:bCs/>
         </w:rPr>
-        <w:t xml:space="preserve">Disputed</w:t>
+        <w:t xml:space="preserve">What happens when I dispute a skill?</w:t>
       </w:r>
       <w:r>
         <w:t xml:space="preserve"> </w:t>
       </w:r>
       <w:r>
-        <w:t xml:space="preserve">- Records your assessed level separately from the employee’s self-assessment</w:t>
-      </w:r>
-      <w:r>
-        <w:t xml:space="preserve"> </w:t>
-      </w:r>
-      <w:r>
-        <w:t xml:space="preserve">- Saves your notes to the validation notes field</w:t>
-      </w:r>
-      <w:r>
-        <w:t xml:space="preserve"> </w:t>
-      </w:r>
-      <w:r>
-        <w:t xml:space="preserve">- Sends the employee an email notification with your notes</w:t>
+        <w:t xml:space="preserve">The employee skill record is marked disputed and stores your suggested level and notes.</w:t>
       </w:r>
     </w:p>
     <w:p>
       <w:pPr>
         <w:pStyle w:val="BodyText"/>
       </w:pPr>
-      <w:r>
-        <w:t xml:space="preserve">Disputing is not punitive — it’s a signal that a conversation about skill development is needed.</w:t>
-      </w:r>
-    </w:p>
-    <w:p>
-      <w:r>
-        <w:pict>
-          <v:rect style="width:0;height:1.5pt" o:hralign="center" o:hrstd="t" o:hr="t"/>
-        </w:pict>
-      </w:r>
-    </w:p>
-    <w:bookmarkEnd w:id="16"/>
-    <w:bookmarkStart w:id="17" w:name="setting-manager-assessments"/>
-    <w:p>
-      <w:pPr>
-        <w:pStyle w:val="Heading2"/>
-      </w:pPr>
-      <w:r>
-        <w:t xml:space="preserve">Setting Manager Assessments</w:t>
-      </w:r>
-    </w:p>
-    <w:p>
-      <w:pPr>
-        <w:pStyle w:val="FirstParagraph"/>
-      </w:pPr>
-      <w:r>
-        <w:t xml:space="preserve">You can set your independent proficiency assessment without changing the validation status:</w:t>
-      </w:r>
-    </w:p>
-    <w:p>
-      <w:pPr>
-        <w:pStyle w:val="Compact"/>
-        <w:numPr>
-          <w:ilvl w:val="0"/>
-          <w:numId w:val="1006"/>
-        </w:numPr>
-      </w:pPr>
-      <w:r>
-        <w:t xml:space="preserve">Click on a skill in the Manager Matrix</w:t>
-      </w:r>
-    </w:p>
-    <w:p>
-      <w:pPr>
-        <w:pStyle w:val="Compact"/>
-        <w:numPr>
-          <w:ilvl w:val="0"/>
-          <w:numId w:val="1006"/>
-        </w:numPr>
-      </w:pPr>
-      <w:r>
-        <w:t xml:space="preserve">Select your assessed level from the dropdown</w:t>
-      </w:r>
-    </w:p>
-    <w:p>
-      <w:pPr>
-        <w:pStyle w:val="Compact"/>
-        <w:numPr>
-          <w:ilvl w:val="0"/>
-          <w:numId w:val="1006"/>
-        </w:numPr>
-      </w:pPr>
-      <w:r>
-        <w:t xml:space="preserve">The assessment is saved alongside the employee’s self-assessment</w:t>
-      </w:r>
-    </w:p>
-    <w:p>
-      <w:pPr>
-        <w:pStyle w:val="FirstParagraph"/>
-      </w:pPr>
-      <w:r>
-        <w:t xml:space="preserve">This is useful when you want to record your perspective before having a conversation with the employee, or when tracking development over time.</w:t>
-      </w:r>
-    </w:p>
-    <w:p>
-      <w:r>
-        <w:pict>
-          <v:rect style="width:0;height:1.5pt" o:hralign="center" o:hrstd="t" o:hr="t"/>
-        </w:pict>
-      </w:r>
-    </w:p>
-    <w:bookmarkEnd w:id="17"/>
-    <w:bookmarkStart w:id="20" w:name="validation-lifecycle"/>
-    <w:p>
-      <w:pPr>
-        <w:pStyle w:val="Heading2"/>
-      </w:pPr>
-      <w:r>
-        <w:t xml:space="preserve">Validation Lifecycle</w:t>
-      </w:r>
-    </w:p>
-    <w:p>
-      <w:pPr>
-        <w:pStyle w:val="SourceCode"/>
-      </w:pPr>
-      <w:r>
-        <w:rPr>
-          <w:rStyle w:val="VerbatimChar"/>
-        </w:rPr>
-        <w:t xml:space="preserve">Pending → Validated → Expired (after 12 months without re-validation)</w:t>
-      </w:r>
-      <w:r>
-        <w:br/>
-      </w:r>
-      <w:r>
-        <w:rPr>
-          <w:rStyle w:val="VerbatimChar"/>
-        </w:rPr>
-        <w:t xml:space="preserve">Pending → Disputed (manager disagrees)</w:t>
-      </w:r>
-      <w:r>
-        <w:br/>
-      </w:r>
-      <w:r>
-        <w:rPr>
-          <w:rStyle w:val="VerbatimChar"/>
-        </w:rPr>
-        <w:t xml:space="preserve">Expired → Validated (manager re-validates)</w:t>
-      </w:r>
-      <w:r>
-        <w:br/>
-      </w:r>
-      <w:r>
-        <w:rPr>
-          <w:rStyle w:val="VerbatimChar"/>
-        </w:rPr>
-        <w:t xml:space="preserve">Disputed → Validated (after discussion and re-validation)</w:t>
-      </w:r>
-    </w:p>
-    <w:bookmarkStart w:id="18" w:name="automatic-expiration"/>
-    <w:p>
-      <w:pPr>
-        <w:pStyle w:val="Heading3"/>
-      </w:pPr>
-      <w:r>
-        <w:t xml:space="preserve">Automatic Expiration</w:t>
-      </w:r>
-    </w:p>
-    <w:p>
-      <w:pPr>
-        <w:pStyle w:val="FirstParagraph"/>
-      </w:pPr>
-      <w:r>
-        <w:t xml:space="preserve">Skills that have been validated but not re-validated within 12 months are automatically set to</w:t>
-      </w:r>
-      <w:r>
-        <w:t xml:space="preserve"> </w:t>
-      </w:r>
       <w:r>
         <w:rPr>
           <w:b/>
           <w:bCs/>
         </w:rPr>
-        <w:t xml:space="preserve">Expired</w:t>
+        <w:t xml:space="preserve">Can I change a disputed skill later?</w:t>
       </w:r>
       <w:r>
         <w:t xml:space="preserve"> </w:t>
       </w:r>
       <w:r>
-        <w:t xml:space="preserve">by a daily system job. This ensures skill data stays current. You will receive monthly email reminders listing employees with pending validations.</w:t>
-      </w:r>
-    </w:p>
-    <w:bookmarkEnd w:id="18"/>
-    <w:bookmarkStart w:id="19" w:name="monthly-reminders"/>
-    <w:p>
-      <w:pPr>
-        <w:pStyle w:val="Heading3"/>
-      </w:pPr>
-      <w:r>
-        <w:t xml:space="preserve">Monthly Reminders</w:t>
-      </w:r>
-    </w:p>
-    <w:p>
-      <w:pPr>
-        <w:pStyle w:val="FirstParagraph"/>
-      </w:pPr>
-      <w:r>
-        <w:t xml:space="preserve">On the 1st of each month, if any of your direct reports have unvalidated skills, you will receive an email summary with:</w:t>
-      </w:r>
-      <w:r>
-        <w:t xml:space="preserve"> </w:t>
-      </w:r>
-      <w:r>
-        <w:t xml:space="preserve">- The count of pending validations</w:t>
-      </w:r>
-      <w:r>
-        <w:t xml:space="preserve"> </w:t>
-      </w:r>
-      <w:r>
-        <w:t xml:space="preserve">- A link to the Skills Hub Manager View</w:t>
-      </w:r>
-    </w:p>
-    <w:p>
-      <w:r>
-        <w:pict>
-          <v:rect style="width:0;height:1.5pt" o:hralign="center" o:hrstd="t" o:hr="t"/>
-        </w:pict>
-      </w:r>
-    </w:p>
-    <w:bookmarkEnd w:id="19"/>
-    <w:bookmarkEnd w:id="20"/>
-    <w:bookmarkStart w:id="24" w:name="best-practices"/>
-    <w:p>
-      <w:pPr>
-        <w:pStyle w:val="Heading2"/>
-      </w:pPr>
-      <w:r>
-        <w:t xml:space="preserve">Best Practices</w:t>
-      </w:r>
-    </w:p>
-    <w:bookmarkStart w:id="21" w:name="regular-validation-cadence"/>
-    <w:p>
-      <w:pPr>
-        <w:pStyle w:val="Heading3"/>
-      </w:pPr>
-      <w:r>
-        <w:t xml:space="preserve">Regular Validation Cadence</w:t>
-      </w:r>
-    </w:p>
-    <w:p>
-      <w:pPr>
-        <w:pStyle w:val="Compact"/>
-        <w:numPr>
-          <w:ilvl w:val="0"/>
-          <w:numId w:val="1007"/>
-        </w:numPr>
+        <w:t xml:space="preserve">Yes. After discussion, validate the skill at the agreed level or update the assessment as appropriate.</w:t>
+      </w:r>
+    </w:p>
+    <w:p>
+      <w:pPr>
+        <w:pStyle w:val="BodyText"/>
       </w:pPr>
       <w:r>
         <w:rPr>
           <w:b/>
           <w:bCs/>
         </w:rPr>
-        <w:t xml:space="preserve">Monthly</w:t>
-      </w:r>
-      <w:r>
-        <w:t xml:space="preserve">: Review the validation reminder email and address any pending skills</w:t>
-      </w:r>
-    </w:p>
-    <w:p>
-      <w:pPr>
-        <w:pStyle w:val="Compact"/>
-        <w:numPr>
-          <w:ilvl w:val="0"/>
-          <w:numId w:val="1007"/>
-        </w:numPr>
-      </w:pPr>
+        <w:t xml:space="preserve">Why do level names vary?</w:t>
+      </w:r>
+      <w:r>
+        <w:t xml:space="preserve"> </w:t>
+      </w:r>
+      <w:r>
+        <w:t xml:space="preserve">Skills use the level scale configured on the skill’s</w:t>
+      </w:r>
+      <w:r>
+        <w:t xml:space="preserve"> </w:t>
+      </w:r>
       <w:r>
         <w:rPr>
-          <w:b/>
-          <w:bCs/>
+          <w:rStyle w:val="VerbatimChar"/>
         </w:rPr>
-        <w:t xml:space="preserve">Quarterly</w:t>
-      </w:r>
-      <w:r>
-        <w:t xml:space="preserve">: Do a comprehensive review of your team’s skill matrix during 1:1s</w:t>
-      </w:r>
-    </w:p>
-    <w:p>
-      <w:pPr>
-        <w:pStyle w:val="Compact"/>
-        <w:numPr>
-          <w:ilvl w:val="0"/>
-          <w:numId w:val="1007"/>
-        </w:numPr>
-      </w:pPr>
-      <w:r>
-        <w:rPr>
-          <w:b/>
-          <w:bCs/>
-        </w:rPr>
-        <w:t xml:space="preserve">On role change</w:t>
-      </w:r>
-      <w:r>
-        <w:t xml:space="preserve">: When an employee changes roles, review and update skill validations</w:t>
-      </w:r>
-    </w:p>
-    <w:bookmarkEnd w:id="21"/>
-    <w:bookmarkStart w:id="22" w:name="handling-disputes-constructively"/>
-    <w:p>
-      <w:pPr>
-        <w:pStyle w:val="Heading3"/>
-      </w:pPr>
-      <w:r>
-        <w:t xml:space="preserve">Handling Disputes Constructively</w:t>
-      </w:r>
-    </w:p>
-    <w:p>
-      <w:pPr>
-        <w:pStyle w:val="Compact"/>
-        <w:numPr>
-          <w:ilvl w:val="0"/>
-          <w:numId w:val="1008"/>
-        </w:numPr>
-      </w:pPr>
-      <w:r>
-        <w:t xml:space="preserve">Always include clear, constructive notes when disputing</w:t>
-      </w:r>
-    </w:p>
-    <w:p>
-      <w:pPr>
-        <w:pStyle w:val="Compact"/>
-        <w:numPr>
-          <w:ilvl w:val="0"/>
-          <w:numId w:val="1008"/>
-        </w:numPr>
-      </w:pPr>
-      <w:r>
-        <w:t xml:space="preserve">Use disputes as a starting point for development conversations</w:t>
-      </w:r>
-    </w:p>
-    <w:p>
-      <w:pPr>
-        <w:pStyle w:val="Compact"/>
-        <w:numPr>
-          <w:ilvl w:val="0"/>
-          <w:numId w:val="1008"/>
-        </w:numPr>
-      </w:pPr>
-      <w:r>
-        <w:t xml:space="preserve">After discussing with the employee, re-validate the skill at the agreed level</w:t>
-      </w:r>
-    </w:p>
-    <w:p>
-      <w:pPr>
-        <w:pStyle w:val="Compact"/>
-        <w:numPr>
-          <w:ilvl w:val="0"/>
-          <w:numId w:val="1008"/>
-        </w:numPr>
-      </w:pPr>
-      <w:r>
-        <w:t xml:space="preserve">Consider creating a development plan for skills where there’s a significant gap</w:t>
-      </w:r>
-    </w:p>
-    <w:bookmarkEnd w:id="22"/>
-    <w:bookmarkStart w:id="23" w:name="leveraging-the-matrix-for-team-planning"/>
-    <w:p>
-      <w:pPr>
-        <w:pStyle w:val="Heading3"/>
-      </w:pPr>
-      <w:r>
-        <w:t xml:space="preserve">Leveraging the Matrix for Team Planning</w:t>
-      </w:r>
-    </w:p>
-    <w:p>
-      <w:pPr>
-        <w:pStyle w:val="Compact"/>
-        <w:numPr>
-          <w:ilvl w:val="0"/>
-          <w:numId w:val="1009"/>
-        </w:numPr>
-      </w:pPr>
-      <w:r>
-        <w:t xml:space="preserve">Use the matrix to identify</w:t>
-      </w:r>
-      <w:r>
-        <w:t xml:space="preserve"> </w:t>
-      </w:r>
-      <w:r>
-        <w:rPr>
-          <w:b/>
-          <w:bCs/>
-        </w:rPr>
-        <w:t xml:space="preserve">skill gaps</w:t>
-      </w:r>
-      <w:r>
-        <w:t xml:space="preserve"> </w:t>
-      </w:r>
-      <w:r>
-        <w:t xml:space="preserve">on your team</w:t>
-      </w:r>
-    </w:p>
-    <w:p>
-      <w:pPr>
-        <w:pStyle w:val="Compact"/>
-        <w:numPr>
-          <w:ilvl w:val="0"/>
-          <w:numId w:val="1009"/>
-        </w:numPr>
-      </w:pPr>
-      <w:r>
-        <w:t xml:space="preserve">Look for skills with no coverage or single-person dependencies</w:t>
-      </w:r>
-    </w:p>
-    <w:p>
-      <w:pPr>
-        <w:pStyle w:val="Compact"/>
-        <w:numPr>
-          <w:ilvl w:val="0"/>
-          <w:numId w:val="1009"/>
-        </w:numPr>
-      </w:pPr>
-      <w:r>
-        <w:t xml:space="preserve">Use the</w:t>
-      </w:r>
-      <w:r>
-        <w:t xml:space="preserve"> </w:t>
-      </w:r>
-      <w:r>
-        <w:rPr>
-          <w:b/>
-          <w:bCs/>
-        </w:rPr>
-        <w:t xml:space="preserve">interest level</w:t>
-      </w:r>
-      <w:r>
-        <w:t xml:space="preserve"> </w:t>
-      </w:r>
-      <w:r>
-        <w:t xml:space="preserve">column to identify employees eager to develop in specific areas</w:t>
-      </w:r>
-    </w:p>
-    <w:p>
-      <w:pPr>
-        <w:pStyle w:val="Compact"/>
-        <w:numPr>
-          <w:ilvl w:val="0"/>
-          <w:numId w:val="1009"/>
-        </w:numPr>
-      </w:pPr>
-      <w:r>
-        <w:t xml:space="preserve">Cross-reference with</w:t>
-      </w:r>
-      <w:r>
-        <w:t xml:space="preserve"> </w:t>
-      </w:r>
-      <w:r>
-        <w:rPr>
-          <w:b/>
-          <w:bCs/>
-        </w:rPr>
-        <w:t xml:space="preserve">endorsement counts</w:t>
-      </w:r>
-      <w:r>
-        <w:t xml:space="preserve"> </w:t>
-      </w:r>
-      <w:r>
-        <w:t xml:space="preserve">to find your team’s recognized experts</w:t>
-      </w:r>
-    </w:p>
-    <w:p>
-      <w:r>
-        <w:pict>
-          <v:rect style="width:0;height:1.5pt" o:hralign="center" o:hrstd="t" o:hr="t"/>
-        </w:pict>
-      </w:r>
-    </w:p>
-    <w:bookmarkEnd w:id="23"/>
-    <w:bookmarkEnd w:id="24"/>
-    <w:bookmarkStart w:id="25" w:name="faq"/>
-    <w:p>
-      <w:pPr>
-        <w:pStyle w:val="Heading2"/>
-      </w:pPr>
-      <w:r>
-        <w:t xml:space="preserve">FAQ</w:t>
-      </w:r>
-    </w:p>
-    <w:p>
-      <w:pPr>
-        <w:pStyle w:val="FirstParagraph"/>
-      </w:pPr>
-      <w:r>
-        <w:rPr>
-          <w:b/>
-          <w:bCs/>
-        </w:rPr>
-        <w:t xml:space="preserve">Q: Can I validate skills for someone who doesn’t report directly to me?</w:t>
-      </w:r>
-      <w:r>
-        <w:t xml:space="preserve"> </w:t>
-      </w:r>
-      <w:r>
-        <w:t xml:space="preserve">A: No. Validation is restricted to your direct reports only (based on the manager field in ServiceNow).</w:t>
-      </w:r>
-    </w:p>
-    <w:p>
-      <w:pPr>
-        <w:pStyle w:val="BodyText"/>
-      </w:pPr>
-      <w:r>
-        <w:rPr>
-          <w:b/>
-          <w:bCs/>
-        </w:rPr>
-        <w:t xml:space="preserve">Q: What happens when I bulk validate?</w:t>
-      </w:r>
-      <w:r>
-        <w:t xml:space="preserve"> </w:t>
-      </w:r>
-      <w:r>
-        <w:t xml:space="preserve">A: All skills with a non-validated status (Pending, Disputed, or Expired) are set to Validated with the current timestamp.</w:t>
-      </w:r>
-    </w:p>
-    <w:p>
-      <w:pPr>
-        <w:pStyle w:val="BodyText"/>
-      </w:pPr>
-      <w:r>
-        <w:rPr>
-          <w:b/>
-          <w:bCs/>
-        </w:rPr>
-        <w:t xml:space="preserve">Q: An employee disagrees with my dispute — what do I do?</w:t>
-      </w:r>
-      <w:r>
-        <w:t xml:space="preserve"> </w:t>
-      </w:r>
-      <w:r>
-        <w:t xml:space="preserve">A: Have a conversation, align on the proficiency level, then validate the skill at the agreed level. The dispute history is preserved in the validation notes.</w:t>
-      </w:r>
-    </w:p>
-    <w:p>
-      <w:pPr>
-        <w:pStyle w:val="BodyText"/>
-      </w:pPr>
-      <w:r>
-        <w:rPr>
-          <w:b/>
-          <w:bCs/>
-        </w:rPr>
-        <w:t xml:space="preserve">Q: I see</w:t>
-      </w:r>
-      <w:r>
-        <w:rPr>
-          <w:b/>
-          <w:bCs/>
-        </w:rPr>
-        <w:t xml:space="preserve"> </w:t>
-      </w:r>
-      <w:r>
-        <w:rPr>
-          <w:b/>
-          <w:bCs/>
-        </w:rPr>
-        <w:t xml:space="preserve">“Expired”</w:t>
-      </w:r>
-      <w:r>
-        <w:rPr>
-          <w:b/>
-          <w:bCs/>
-        </w:rPr>
-        <w:t xml:space="preserve"> </w:t>
-      </w:r>
-      <w:r>
-        <w:rPr>
-          <w:b/>
-          <w:bCs/>
-        </w:rPr>
-        <w:t xml:space="preserve">skills — is that bad?</w:t>
-      </w:r>
-      <w:r>
-        <w:t xml:space="preserve"> </w:t>
-      </w:r>
-      <w:r>
-        <w:t xml:space="preserve">A: Not necessarily. It means the skill hasn’t been re-validated in over 12 months. Review and re-validate during your next 1:1.</w:t>
-      </w:r>
-    </w:p>
-    <w:p>
-      <w:pPr>
-        <w:pStyle w:val="BodyText"/>
-      </w:pPr>
-      <w:r>
-        <w:rPr>
-          <w:b/>
-          <w:bCs/>
-        </w:rPr>
-        <w:t xml:space="preserve">Q: How does my validation affect the employee’s gamification points?</w:t>
-      </w:r>
-      <w:r>
-        <w:t xml:space="preserve"> </w:t>
-      </w:r>
-      <w:r>
-        <w:t xml:space="preserve">A: Each validated skill adds +15 points to the employee’s total. Disputed skills do not award points.</w:t>
-      </w:r>
-    </w:p>
-    <w:p>
-      <w:pPr>
-        <w:pStyle w:val="BodyText"/>
-      </w:pPr>
-      <w:r>
-        <w:rPr>
-          <w:b/>
-          <w:bCs/>
-        </w:rPr>
-        <w:t xml:space="preserve">Q: Can I see skills for employees who don’t report to me?</w:t>
-      </w:r>
-      <w:r>
-        <w:t xml:space="preserve"> </w:t>
-      </w:r>
-      <w:r>
-        <w:t xml:space="preserve">A: You can see any employee’s skills through Find an Expert, but you can only validate/dispute skills for your direct reports.</w:t>
-      </w:r>
-    </w:p>
-    <w:bookmarkEnd w:id="25"/>
-    <w:bookmarkEnd w:id="26"/>
+        <w:t xml:space="preserve">cmn_skill.level_type</w:t>
+      </w:r>
+      <w:r>
+        <w:t xml:space="preserve">, so labels may differ across skills.</w:t>
+      </w:r>
+    </w:p>
+    <w:bookmarkEnd w:id="17"/>
+    <w:bookmarkEnd w:id="18"/>
     <w:sectPr>
       <w:footnotePr>
         <w:numRestart w:val="eachSect"/>
@@ -1750,99 +1371,6 @@
     </w:lvlOverride>
   </w:num>
   <w:num w:numId="1005">
-    <w:abstractNumId w:val="99411"/>
-    <w:lvlOverride w:ilvl="0">
-      <w:startOverride w:val="1"/>
-    </w:lvlOverride>
-    <w:lvlOverride w:ilvl="1">
-      <w:startOverride w:val="1"/>
-    </w:lvlOverride>
-    <w:lvlOverride w:ilvl="2">
-      <w:startOverride w:val="1"/>
-    </w:lvlOverride>
-    <w:lvlOverride w:ilvl="3">
-      <w:startOverride w:val="1"/>
-    </w:lvlOverride>
-    <w:lvlOverride w:ilvl="4">
-      <w:startOverride w:val="1"/>
-    </w:lvlOverride>
-    <w:lvlOverride w:ilvl="5">
-      <w:startOverride w:val="1"/>
-    </w:lvlOverride>
-    <w:lvlOverride w:ilvl="6">
-      <w:startOverride w:val="1"/>
-    </w:lvlOverride>
-    <w:lvlOverride w:ilvl="7">
-      <w:startOverride w:val="1"/>
-    </w:lvlOverride>
-    <w:lvlOverride w:ilvl="8">
-      <w:startOverride w:val="1"/>
-    </w:lvlOverride>
-  </w:num>
-  <w:num w:numId="1006">
-    <w:abstractNumId w:val="99411"/>
-    <w:lvlOverride w:ilvl="0">
-      <w:startOverride w:val="1"/>
-    </w:lvlOverride>
-    <w:lvlOverride w:ilvl="1">
-      <w:startOverride w:val="1"/>
-    </w:lvlOverride>
-    <w:lvlOverride w:ilvl="2">
-      <w:startOverride w:val="1"/>
-    </w:lvlOverride>
-    <w:lvlOverride w:ilvl="3">
-      <w:startOverride w:val="1"/>
-    </w:lvlOverride>
-    <w:lvlOverride w:ilvl="4">
-      <w:startOverride w:val="1"/>
-    </w:lvlOverride>
-    <w:lvlOverride w:ilvl="5">
-      <w:startOverride w:val="1"/>
-    </w:lvlOverride>
-    <w:lvlOverride w:ilvl="6">
-      <w:startOverride w:val="1"/>
-    </w:lvlOverride>
-    <w:lvlOverride w:ilvl="7">
-      <w:startOverride w:val="1"/>
-    </w:lvlOverride>
-    <w:lvlOverride w:ilvl="8">
-      <w:startOverride w:val="1"/>
-    </w:lvlOverride>
-  </w:num>
-  <w:num w:numId="1007">
-    <w:abstractNumId w:val="991"/>
-  </w:num>
-  <w:num w:numId="1008">
-    <w:abstractNumId w:val="99411"/>
-    <w:lvlOverride w:ilvl="0">
-      <w:startOverride w:val="1"/>
-    </w:lvlOverride>
-    <w:lvlOverride w:ilvl="1">
-      <w:startOverride w:val="1"/>
-    </w:lvlOverride>
-    <w:lvlOverride w:ilvl="2">
-      <w:startOverride w:val="1"/>
-    </w:lvlOverride>
-    <w:lvlOverride w:ilvl="3">
-      <w:startOverride w:val="1"/>
-    </w:lvlOverride>
-    <w:lvlOverride w:ilvl="4">
-      <w:startOverride w:val="1"/>
-    </w:lvlOverride>
-    <w:lvlOverride w:ilvl="5">
-      <w:startOverride w:val="1"/>
-    </w:lvlOverride>
-    <w:lvlOverride w:ilvl="6">
-      <w:startOverride w:val="1"/>
-    </w:lvlOverride>
-    <w:lvlOverride w:ilvl="7">
-      <w:startOverride w:val="1"/>
-    </w:lvlOverride>
-    <w:lvlOverride w:ilvl="8">
-      <w:startOverride w:val="1"/>
-    </w:lvlOverride>
-  </w:num>
-  <w:num w:numId="1009">
     <w:abstractNumId w:val="991"/>
   </w:num>
 </w:numbering>

</xml_diff>